<commit_message>
Final reference check: replace withdrawn Cochrane review, match each citation to its claim
- Bradt & Dileo 2014 (CD007169.pub3) is a withdrawal notice; replaced by
  Bissonnette et al. 2024 (hypnosis and music in palliative care, meta-analysis)
- Koelsch 2014 supports limbic modulation by music, not brainstem processing
  without cortex; that claim now cites Koch 1999 (acoustic startle circuit)
- LeDoux 2000 phrased as conditioned fear to tones via the thalamic route
- Woolf 2011 row states central sensitisation only; arousal link is the proposal's
- Smith MT author initials from PubMed
- Model interpretation made conditional; P3 described as the most direct early
  test of the auditory-autonomic link, not the decisive test

Co-Authored-By: Claude Opus 5.5 <noreply@anthropic.com>
</commit_message>
<xml_diff>
--- a/manuscript/Auditory_Cardiac_Channel_MedicalHypotheses.docx
+++ b/manuscript/Auditory_Cardiac_Channel_MedicalHypotheses.docx
@@ -71,7 +71,7 @@
           <w:i w:val="0"/>
           <w:sz w:val="22"/>
         </w:rPr>
-        <w:t>In the last days of life, opioid infusion is commonly titrated against observed signs of distress, but these signs may reflect nociception, autonomic arousal, delirium, or opioid-related neurotoxicity. Where clearance of active metabolites declines, escalation and accumulation can interact: accumulation may produce agitation, agitation may be read as pain, and perceived pain may prompt further escalation. We propose that part of this escalation is driven not by nociception but by a self-reinforcing loop between autonomic arousal and perceived distress, and that the loop may be accessible through hearing. We separate what is established (auditory information reaches brainstem structures without requiring cortical processing; autonomic regulation involves brainstem, limbic and cortical structures; tone-evoked auditory potentials persist in actively dying patients) from what is hypothesised (that residual auditory processing can be used to lower autonomic arousal in dying patients) and from what is untested (whether this changes opioid requirement). A minimal, fully specified model of the loop, with illustrative parameters and a sensitivity analysis, indicates that damping arousal postpones rather than prevents metabolite accumulation, with a benefit bounded at about a day in the base case. We give five falsifiable predictions, a feasibility protocol for heart rate variability measurement in dying patients, and the conditions under which the proposal would cause harm. No patient data were collected, and nothing here is a treatment recommendation or a reason to withhold or delay analgesia.</w:t>
+        <w:t>In the last days of life, opioid infusion is commonly titrated against observed signs of distress, but these signs may reflect nociception, autonomic arousal, delirium, or opioid-related neurotoxicity. Where clearance of active metabolites declines, escalation and accumulation can interact: accumulation may produce agitation, agitation may be read as pain, and perceived pain may prompt further escalation. We propose that part of this escalation is driven not by nociception but by a self-reinforcing loop between autonomic arousal and perceived distress, and that the loop may be accessible through hearing. We separate what is established (auditory information is processed in brainstem circuits before it reaches cortex; autonomic regulation involves brainstem, limbic and cortical structures; tone-evoked auditory potentials persist in actively dying patients) from what is hypothesised (that residual auditory processing can be used to lower autonomic arousal in dying patients) and from what is untested (whether this changes opioid requirement). A minimal, fully specified model of the loop, with illustrative parameters and a sensitivity analysis, indicates that damping arousal postpones rather than prevents metabolite accumulation, with a benefit bounded at about a day in the base case. We give five falsifiable predictions, a feasibility protocol for heart rate variability measurement in dying patients, and the conditions under which the proposal would cause harm. No patient data were collected, and nothing here is a treatment recommendation or a reason to withhold or delay analgesia.</w:t>
       </w:r>
     </w:p>
     <w:p>
@@ -216,7 +216,7 @@
         <w:rPr>
           <w:sz w:val="22"/>
         </w:rPr>
-        <w:t>auditory information reaches brainstem structures without requiring cortical processing [7].</w:t>
+        <w:t>auditory information is processed in brainstem circuits before it reaches cortex, and some of those circuits drive fast responses, such as the acoustic startle, without cortical involvement [7].</w:t>
       </w:r>
     </w:p>
     <w:p>
@@ -310,7 +310,7 @@
           <w:i w:val="0"/>
           <w:sz w:val="22"/>
         </w:rPr>
-        <w:t>Acoustic signals reach the brainstem through the cochlear nuclei, superior olivary complex and inferior colliculus before thalamocortical routing, and some acoustic features elicit brainstem-level reflexive and autonomic responses without requiring cortical processing [7]. In animal studies, a direct projection from the auditory thalamus to the amygdala supports conditioned autonomic responses to sound without passing through auditory cortex [10]. Whether any such route remains functional, or usable, in actively dying patients is not known.</w:t>
+        <w:t>Acoustic signals reach the brainstem through the cochlear nuclei, superior olivary complex and inferior colliculus before thalamocortical routing, and some brainstem auditory circuits act without cortical involvement: the acoustic startle response is mediated by a circuit in the lower brainstem [7]. In animal studies of fear conditioning, the amygdala receives auditory input directly from the auditory thalamus as well as from auditory cortex, and conditioned fear responses to simple tones can be acquired through the thalamic route [10]. In healthy people, functional neuroimaging shows that music modulates activity in structures involved in autonomic regulation, including the amygdala, hypothalamus, insula and cingulate cortex [11]. Whether any of these routes remains functional, or usable, in actively dying patients is not known.</w:t>
       </w:r>
     </w:p>
     <w:p>
@@ -342,7 +342,7 @@
         <w:rPr>
           <w:sz w:val="22"/>
         </w:rPr>
-        <w:t>Auditory event-related potentials to tone sequences persist in actively dying hospice patients, in some cases within hours of death, and resemble those of healthy controls [11]. This establishes that the auditory system is still processing structured acoustic input at the end of life. It does not establish that words are being understood.</w:t>
+        <w:t>Auditory event-related potentials to tone sequences persist in actively dying hospice patients, in some cases within hours of death, and resemble those of healthy controls [12]. This establishes that the auditory system is still processing structured acoustic input at the end of life. It does not establish that words are being understood.</w:t>
       </w:r>
     </w:p>
     <w:p>
@@ -361,7 +361,7 @@
         <w:rPr>
           <w:sz w:val="22"/>
         </w:rPr>
-        <w:t>The N400, an index of semantic mismatch, has been recorded in patients with disorders of consciousness, where its presence predicts later recovery [12]. This establishes that automatic semantic processing can survive profound unresponsiveness. It was not measured in dying patients, and its absence in many such patients is precisely what makes it prognostic.</w:t>
+        <w:t>The N400, an index of semantic mismatch, has been recorded in patients with disorders of consciousness, where its presence predicts later recovery [13]. This establishes that automatic semantic processing can survive profound unresponsiveness. It was not measured in dying patients, and its absence in many such patients is precisely what makes it prognostic.</w:t>
       </w:r>
     </w:p>
     <w:p>
@@ -398,7 +398,7 @@
           <w:i w:val="0"/>
           <w:sz w:val="22"/>
         </w:rPr>
-        <w:t>The route from processed sound to cardiac output runs through the central autonomic network, a set of brainstem, hypothalamic, limbic and cortical structures that regulate autonomic outflow [8]. Under the neurovisceral integration account, prefrontal and limbic structures exert inhibitory control over sympathoexcitatory circuits, with vagally mediated heart rate variability as the accessible index of that control [9]. Afferent traffic from baroreceptors returns through the nucleus tractus solitarius to the insular cortex, which supports interoceptive representation of bodily state [13]. In healthy people the loop is bidirectional: cardiac state is an input to affective state as well as an output of it. None of these links has been examined in actively dying patients.</w:t>
+        <w:t>The route from processed sound to cardiac output runs through the central autonomic network, a set of brainstem, hypothalamic, limbic and cortical structures that regulate autonomic outflow [8]. Under the neurovisceral integration account, prefrontal and limbic structures exert inhibitory control over sympathoexcitatory circuits, with vagally mediated heart rate variability as the accessible index of that control [9]. Afferent traffic from baroreceptors returns through the nucleus tractus solitarius to the insular cortex, which supports interoceptive representation of bodily state [14]. In healthy people the loop is bidirectional: cardiac state is an input to affective state as well as an output of it. None of these links has been examined in actively dying patients.</w:t>
       </w:r>
     </w:p>
     <w:p>
@@ -411,7 +411,7 @@
           <w:i w:val="0"/>
           <w:sz w:val="22"/>
         </w:rPr>
-        <w:t>Hypnosis offers a supporting analogy rather than direct evidence. In healthy volunteers, suggestion directed at unpleasantness rather than intensity altered anterior cingulate activity without corresponding change in primary somatosensory cortex [14], showing that the affective component of pain can be moved while the sensory component is left intact, and meta-analysis supports an analgesic effect of hypnotic procedures [15]. These findings come from conscious, responsive people and are not evidence that the same effect occurs in dying patients. The argument does not depend on them; the chain it does depend on is auditory processing → autonomic state → distress → opioid titration → metabolite accumulation.</w:t>
+        <w:t>Hypnosis offers a supporting analogy rather than direct evidence. In healthy volunteers, suggestion directed at unpleasantness rather than intensity altered anterior cingulate activity without corresponding change in primary somatosensory cortex [15], showing that the affective component of pain can be moved while the sensory component is left intact, and meta-analysis supports an analgesic effect of hypnotic procedures [16]. These findings come from conscious, responsive people and are not evidence that the same effect occurs in dying patients. The argument does not depend on them; the chain it does depend on is auditory processing → autonomic state → distress → opioid titration → metabolite accumulation.</w:t>
       </w:r>
     </w:p>
     <w:p>
@@ -461,7 +461,7 @@
         <w:rPr>
           <w:sz w:val="19"/>
         </w:rPr>
-        <w:t>Figure 1. The proposed auditory–cardiac pathway. Grey boxes are established anatomy. Green marks the only step measured in dying patients: tone-evoked auditory event-related potentials [11]; semantic processing has not been measured in this population. Orange dashed boxes and arrows are proposed links that are untested in dying patients; the subcortical route to the amygdala is described in animal studies [10]. Blue marks the proposed intervention and the proposed readout. The red dashed limb is the proposed feedback from interoceptive state to threat appraisal. Anatomical connection is not evidence of a therapeutic effect.</w:t>
+        <w:t>Figure 1. The proposed auditory–cardiac pathway. Grey boxes are established anatomy. Green marks the only step measured in dying patients: tone-evoked auditory event-related potentials [12]; semantic processing has not been measured in this population. Orange dashed boxes and arrows are proposed links that are untested in dying patients; the subcortical route to the amygdala is described in animal studies [10]. Blue marks the proposed intervention and the proposed readout. The red dashed limb is the proposed feedback from interoceptive state to threat appraisal. Anatomical connection is not evidence of a therapeutic effect.</w:t>
       </w:r>
     </w:p>
     <w:p>
@@ -3142,7 +3142,7 @@
           <w:i w:val="0"/>
           <w:sz w:val="22"/>
         </w:rPr>
-        <w:t>That the modelled benefit is bounded is not a weakness of the proposal but the most useful thing the model says. An intervention that postpones the point of accumulation-driven agitation by hours is worth having if those hours are lucid and the patient's family is present. An intervention sold as a way to avoid opioid escalation would be both wrong and dangerous.</w:t>
+        <w:t>That the modelled benefit is bounded is not a weakness of the proposal but the most useful thing the model says. If an intervention were shown to postpone accumulation-driven agitation without compromising comfort, the resulting interval could be clinically meaningful, particularly if responsiveness were preserved. An intervention sold as a way to avoid opioid escalation would be both wrong and dangerous.</w:t>
       </w:r>
     </w:p>
     <w:p>
@@ -3250,7 +3250,7 @@
               <w:rPr>
                 <w:sz w:val="18"/>
               </w:rPr>
-              <w:t>Auditory information reaches brainstem structures and can evoke autonomic responses without requiring cortical processing</w:t>
+              <w:t>Brainstem auditory circuits can drive responses without cortical involvement</w:t>
             </w:r>
           </w:p>
         </w:tc>
@@ -3267,7 +3267,7 @@
               <w:rPr>
                 <w:sz w:val="18"/>
               </w:rPr>
-              <w:t>Demonstrated (healthy humans)</w:t>
+              <w:t>Demonstrated</w:t>
             </w:r>
           </w:p>
         </w:tc>
@@ -3284,7 +3284,7 @@
               <w:rPr>
                 <w:sz w:val="18"/>
               </w:rPr>
-              <w:t>Review of brainstem and limbic responses to sound [7]</w:t>
+              <w:t>Acoustic startle circuit in the lower brainstem [7]</w:t>
             </w:r>
           </w:p>
         </w:tc>
@@ -3303,7 +3303,7 @@
               <w:rPr>
                 <w:sz w:val="18"/>
               </w:rPr>
-              <w:t>A direct auditory thalamus → amygdala route supports autonomic responses to sound</w:t>
+              <w:t>A direct auditory thalamus → amygdala route supports conditioned fear responses to tones</w:t>
             </w:r>
           </w:p>
         </w:tc>
@@ -3356,6 +3356,59 @@
               <w:rPr>
                 <w:sz w:val="18"/>
               </w:rPr>
+              <w:t>Sound modulates activity in limbic structures involved in autonomic regulation</w:t>
+            </w:r>
+          </w:p>
+        </w:tc>
+        <w:tc>
+          <w:tcPr>
+            <w:tcW w:type="dxa" w:w="3120"/>
+          </w:tcPr>
+          <w:p>
+            <w:pPr>
+              <w:spacing w:line="240" w:lineRule="auto" w:after="20"/>
+            </w:pPr>
+            <w:r/>
+            <w:r>
+              <w:rPr>
+                <w:sz w:val="18"/>
+              </w:rPr>
+              <w:t>Demonstrated (healthy humans)</w:t>
+            </w:r>
+          </w:p>
+        </w:tc>
+        <w:tc>
+          <w:tcPr>
+            <w:tcW w:type="dxa" w:w="3120"/>
+          </w:tcPr>
+          <w:p>
+            <w:pPr>
+              <w:spacing w:line="240" w:lineRule="auto" w:after="20"/>
+            </w:pPr>
+            <w:r/>
+            <w:r>
+              <w:rPr>
+                <w:sz w:val="18"/>
+              </w:rPr>
+              <w:t>Functional neuroimaging of music-evoked emotion [11]</w:t>
+            </w:r>
+          </w:p>
+        </w:tc>
+      </w:tr>
+      <w:tr>
+        <w:tc>
+          <w:tcPr>
+            <w:tcW w:type="dxa" w:w="3120"/>
+          </w:tcPr>
+          <w:p>
+            <w:pPr>
+              <w:spacing w:line="240" w:lineRule="auto" w:after="20"/>
+            </w:pPr>
+            <w:r/>
+            <w:r>
+              <w:rPr>
+                <w:sz w:val="18"/>
+              </w:rPr>
               <w:t>Auditory ERPs to structured tone sequences persist in actively dying patients</w:t>
             </w:r>
           </w:p>
@@ -3390,7 +3443,7 @@
               <w:rPr>
                 <w:sz w:val="18"/>
               </w:rPr>
-              <w:t>Direct measurement in hospice patients [11]</w:t>
+              <w:t>Direct measurement in hospice patients [12]</w:t>
             </w:r>
           </w:p>
         </w:tc>
@@ -3443,7 +3496,7 @@
               <w:rPr>
                 <w:sz w:val="18"/>
               </w:rPr>
-              <w:t>N400 in disorders of consciousness [12]</w:t>
+              <w:t>N400 in disorders of consciousness [13]</w:t>
             </w:r>
           </w:p>
         </w:tc>
@@ -3602,7 +3655,7 @@
               <w:rPr>
                 <w:sz w:val="18"/>
               </w:rPr>
-              <w:t>ACC dissociation in healthy volunteers [14]</w:t>
+              <w:t>ACC dissociation in healthy volunteers [15]</w:t>
             </w:r>
           </w:p>
         </w:tc>
@@ -3655,7 +3708,7 @@
               <w:rPr>
                 <w:sz w:val="18"/>
               </w:rPr>
-              <w:t>Randomised evidence in conscious sedation [16]; meta-analysis [15]</w:t>
+              <w:t>Randomised evidence in conscious sedation [17]; meta-analysis [16]</w:t>
             </w:r>
           </w:p>
         </w:tc>
@@ -3674,7 +3727,7 @@
               <w:rPr>
                 <w:sz w:val="18"/>
               </w:rPr>
-              <w:t>Arousal amplifies perceived pain via central sensitisation</w:t>
+              <w:t>Central mechanisms can amplify pain beyond the peripheral input (central sensitisation)</w:t>
             </w:r>
           </w:p>
         </w:tc>
@@ -3691,7 +3744,7 @@
               <w:rPr>
                 <w:sz w:val="18"/>
               </w:rPr>
-              <w:t>Supported</w:t>
+              <w:t>Demonstrated (other populations)</w:t>
             </w:r>
           </w:p>
         </w:tc>
@@ -3708,7 +3761,7 @@
               <w:rPr>
                 <w:sz w:val="18"/>
               </w:rPr>
-              <w:t>Mechanistic review [17]</w:t>
+              <w:t>Mechanistic review [18]; a contribution from arousal is part of this proposal, not of the review</w:t>
             </w:r>
           </w:p>
         </w:tc>
@@ -3987,7 +4040,7 @@
         <w:rPr>
           <w:sz w:val="19"/>
         </w:rPr>
-        <w:t>Table 3. Status of each link in the chain. Rows 5, 10, 11 and 12 are the load-bearing untested claims and are the targets of the experimental programme in Section 7. 'Analogy only' marks evidence from conscious people that the argument does not depend on.</w:t>
+        <w:t>Table 3. Status of each link in the chain. Rows 6, 11, 12 and 13 are the load-bearing untested claims and are the targets of the experimental programme in Section 7. 'Analogy only' marks evidence from conscious people that the argument does not depend on.</w:t>
       </w:r>
     </w:p>
     <w:p>
@@ -4114,7 +4167,7 @@
           <w:i w:val="0"/>
           <w:sz w:val="22"/>
         </w:rPr>
-        <w:t>P3 is the decisive early test. It is non-invasive, requires no protocol deviation, and would be informative whichever way it resolved.</w:t>
+        <w:t>P3 is the most direct early test of the proposed auditory–autonomic link. It does not test the rest of the chain to opioid escalation, which P2 and P4 address, but it is non-invasive, requires no protocol deviation, and would be informative whichever way it resolved.</w:t>
       </w:r>
     </w:p>
     <w:p>
@@ -4132,7 +4185,7 @@
         <w:rPr>
           <w:sz w:val="22"/>
         </w:rPr>
-        <w:t>High-frequency heart rate variability is hard to measure in actively dying patients, and a protocol has to plan for that rather than discover it. Atrial fibrillation and frequent ectopy make short-term HRV uninterpretable, so patients in atrial fibrillation are excluded and ectopic beats are corrected or excluded by rules fixed in advance [18]. High-frequency power tracks respiratory sinus arrhythmia, so changes in breathing rate or pattern — including periodic and terminal breathing — move it independently of vagal tone; respiration must be recorded alongside the ECG and high-frequency indices interpreted only when breathing lies within the 0.15–0.40 Hz band [19]. Anticholinergics given for respiratory secretions, and opioids and sedatives themselves, alter cardiac vagal activity, so every dose is time-stamped and blocks adjacent to a bolus are excluded. Signal quality should come from ECG rather than photoplethysmography, at a sampling rate of at least 250 Hz [18], with the proportion of edited beats reported per segment and segments above a preset threshold discarded. Because the autonomic state of a dying patient drifts over hours, the comparison should be within patient: alternating short blocks of structured verbal input and a matched acoustic control, with the change in log high-frequency power or RMSSD as the outcome. The first study should report feasibility itself — the fraction of eligible patients and of recorded blocks that yield analysable data — because if that fraction is small, P3 cannot be tested in this population by this method.</w:t>
+        <w:t>High-frequency heart rate variability is hard to measure in actively dying patients, and a protocol has to plan for that rather than discover it. Atrial fibrillation and frequent ectopy make short-term HRV uninterpretable, so patients in atrial fibrillation are excluded and ectopic beats are corrected or excluded by rules fixed in advance [19]. High-frequency power tracks respiratory sinus arrhythmia, so changes in breathing rate or pattern — including periodic and terminal breathing — move it independently of vagal tone; respiration must be recorded alongside the ECG and high-frequency indices interpreted only when breathing lies within the 0.15–0.40 Hz band [20]. Anticholinergics given for respiratory secretions, and opioids and sedatives themselves, alter cardiac vagal activity, so every dose is time-stamped and blocks adjacent to a bolus are excluded. Signal quality should come from ECG rather than photoplethysmography, at a sampling rate of at least 250 Hz [19], with the proportion of edited beats reported per segment and segments above a preset threshold discarded. Because the autonomic state of a dying patient drifts over hours, the comparison should be within patient: alternating short blocks of structured verbal input and a matched acoustic control, with the change in log high-frequency power or RMSSD as the outcome. The first study should report feasibility itself — the fraction of eligible patients and of recorded blocks that yield analysable data — because if that fraction is small, P3 cannot be tested in this population by this method.</w:t>
       </w:r>
     </w:p>
     <w:p>
@@ -4246,7 +4299,7 @@
         <w:rPr>
           <w:sz w:val="22"/>
         </w:rPr>
-        <w:t>Music therapy at the end of life has been systematically reviewed, with evidence judged insufficient for confident conclusions [20]. A new adjunct with weaker evidence should not compete for the same resources.</w:t>
+        <w:t>Music and hypnosis interventions in palliative care have been systematically reviewed: they appear feasible and acceptable, with a moderate reduction in pain across a small number of randomised trials, but the evidence is too limited to compare interventions or establish effects on most other outcomes [21]. A new adjunct with weaker evidence should not compete for the same resources.</w:t>
       </w:r>
     </w:p>
     <w:p>
@@ -4270,7 +4323,7 @@
           <w:i w:val="0"/>
           <w:sz w:val="22"/>
         </w:rPr>
-        <w:t>Soothing speech, familiar voices and music are already part of good hospice practice, and hypnotherapy has been delivered to palliative patients for anxiety [21]. The claim here is narrower than 'sound helps'. It is that a specific, measurable autonomic pathway mediates the effect; that the relevant outcome is the trajectory of opioid requirement rather than a comfort score; and that the mechanism predicts a bounded, quantifiable benefit which can be tested and found absent. Existing practice is compatible with the hypothesis but does not test it, because it has not been paired with autonomic measurement or dose trajectory as endpoints.</w:t>
+        <w:t>Soothing speech, familiar voices and music are already part of good hospice practice, hypnotherapy has been delivered to palliative patients for anxiety [22], and music and hypnosis interventions in palliative care have been evaluated for pain, anxiety, sleep and well-being [21]. The claim here is narrower than 'sound helps'. It is that a specific, measurable autonomic pathway mediates the effect; that the relevant outcome is the trajectory of opioid requirement rather than a comfort score; and that the mechanism predicts a bounded, quantifiable benefit which can be tested and found absent. Existing practice is compatible with the hypothesis but does not test it: to our knowledge, it has not been paired with autonomic measurement or opioid dose trajectory as endpoints.</w:t>
       </w:r>
     </w:p>
     <w:p>
@@ -4438,7 +4491,7 @@
         <w:rPr>
           <w:sz w:val="19"/>
         </w:rPr>
-        <w:t>[5] Smith M. Neuroexcitatory Effects Of Morphine And Hydromorphone: Evidence Implicating The 3‐Glucuronide Metabolites. Clinical and Experimental Pharmacology and Physiology 2000;27:524-528. https://doi.org/10.1046/j.1440-1681.2000.03290.x</w:t>
+        <w:t>[5] Smith MT. Neuroexcitatory Effects Of Morphine And Hydromorphone: Evidence Implicating The 3‐Glucuronide Metabolites. Clinical and Experimental Pharmacology and Physiology 2000;27:524-528. https://doi.org/10.1046/j.1440-1681.2000.03290.x</w:t>
       </w:r>
     </w:p>
     <w:p>
@@ -4462,7 +4515,7 @@
         <w:rPr>
           <w:sz w:val="19"/>
         </w:rPr>
-        <w:t>[7] Koelsch S. Brain correlates of music-evoked emotions. Nature Reviews Neuroscience 2014;15:170-180. https://doi.org/10.1038/nrn3666</w:t>
+        <w:t>[7] Koch M. The neurobiology of startle. Progress in Neurobiology 1999;59:107-128. https://doi.org/10.1016/s0301-0082(98)00098-7</w:t>
       </w:r>
     </w:p>
     <w:p>
@@ -4510,7 +4563,7 @@
         <w:rPr>
           <w:sz w:val="19"/>
         </w:rPr>
-        <w:t>[11] Blundon EG, Gallagher RE, Ward LM. Electrophysiological evidence of preserved hearing at the end of life. Scientific Reports 2020;10:10336. https://doi.org/10.1038/s41598-020-67234-9</w:t>
+        <w:t>[11] Koelsch S. Brain correlates of music-evoked emotions. Nature Reviews Neuroscience 2014;15:170-180. https://doi.org/10.1038/nrn3666</w:t>
       </w:r>
     </w:p>
     <w:p>
@@ -4522,7 +4575,7 @@
         <w:rPr>
           <w:sz w:val="19"/>
         </w:rPr>
-        <w:t>[12] Steppacher I, Eickhoff S, Jordanov T, Kaps M, Witzke W, Kissler J. N400 predicts recovery from disorders of consciousness. Annals of Neurology 2013;73:594-602. https://doi.org/10.1002/ana.23835</w:t>
+        <w:t>[12] Blundon EG, Gallagher RE, Ward LM. Electrophysiological evidence of preserved hearing at the end of life. Scientific Reports 2020;10:10336. https://doi.org/10.1038/s41598-020-67234-9</w:t>
       </w:r>
     </w:p>
     <w:p>
@@ -4534,7 +4587,7 @@
         <w:rPr>
           <w:sz w:val="19"/>
         </w:rPr>
-        <w:t>[13] Critchley HD, Wiens S, Rotshtein P, Öhman A, Dolan RJ. Neural systems supporting interoceptive awareness. Nature Neuroscience 2004;7:189-195. https://doi.org/10.1038/nn1176</w:t>
+        <w:t>[13] Steppacher I, Eickhoff S, Jordanov T, Kaps M, Witzke W, Kissler J. N400 predicts recovery from disorders of consciousness. Annals of Neurology 2013;73:594-602. https://doi.org/10.1002/ana.23835</w:t>
       </w:r>
     </w:p>
     <w:p>
@@ -4546,7 +4599,7 @@
         <w:rPr>
           <w:sz w:val="19"/>
         </w:rPr>
-        <w:t>[14] Rainville P, Duncan GH, Price DD, Carrier B, Bushnell MC. Pain Affect Encoded in Human Anterior Cingulate But Not Somatosensory Cortex. Science 1997;277:968-971. https://doi.org/10.1126/science.277.5328.968</w:t>
+        <w:t>[14] Critchley HD, Wiens S, Rotshtein P, Öhman A, Dolan RJ. Neural systems supporting interoceptive awareness. Nature Neuroscience 2004;7:189-195. https://doi.org/10.1038/nn1176</w:t>
       </w:r>
     </w:p>
     <w:p>
@@ -4558,7 +4611,7 @@
         <w:rPr>
           <w:sz w:val="19"/>
         </w:rPr>
-        <w:t>[15] Montgomery GH, Duhamel KN, Redd WH. A meta-analysis of hypnotically induced analgesia: How effective is hypnosis? International Journal of Clinical and Experimental Hypnosis 2000;48:138-153. https://doi.org/10.1080/00207140008410045</w:t>
+        <w:t>[15] Rainville P, Duncan GH, Price DD, Carrier B, Bushnell MC. Pain Affect Encoded in Human Anterior Cingulate But Not Somatosensory Cortex. Science 1997;277:968-971. https://doi.org/10.1126/science.277.5328.968</w:t>
       </w:r>
     </w:p>
     <w:p>
@@ -4570,7 +4623,7 @@
         <w:rPr>
           <w:sz w:val="19"/>
         </w:rPr>
-        <w:t>[16] Faymonville EM, Mambourg HP, Joris J, Vrijens B, Fissette J, Albert A, et al. Psychological approaches during conscious sedation. Hypnosis versus stress reducing strategies: a prospective randomized study. Pain 1997;73:361-367. https://doi.org/10.1016/s0304-3959(97)00122-x</w:t>
+        <w:t>[16] Montgomery GH, Duhamel KN, Redd WH. A meta-analysis of hypnotically induced analgesia: How effective is hypnosis? International Journal of Clinical and Experimental Hypnosis 2000;48:138-153. https://doi.org/10.1080/00207140008410045</w:t>
       </w:r>
     </w:p>
     <w:p>
@@ -4582,7 +4635,7 @@
         <w:rPr>
           <w:sz w:val="19"/>
         </w:rPr>
-        <w:t>[17] Woolf CJ. Central sensitization: Implications for the diagnosis and treatment of pain. Pain 2011;152:S2-S15. https://doi.org/10.1016/j.pain.2010.09.030</w:t>
+        <w:t>[17] Faymonville EM, Mambourg HP, Joris J, Vrijens B, Fissette J, Albert A, et al. Psychological approaches during conscious sedation. Hypnosis versus stress reducing strategies: a prospective randomized study. Pain 1997;73:361-367. https://doi.org/10.1016/s0304-3959(97)00122-x</w:t>
       </w:r>
     </w:p>
     <w:p>
@@ -4594,7 +4647,7 @@
         <w:rPr>
           <w:sz w:val="19"/>
         </w:rPr>
-        <w:t>[18] Task Force of the European Society of Cardiology and the North American Society of Pacing and Electrophysiology. Heart rate variability: standards of measurement, physiological interpretation and clinical use. Circulation 1996;93:1043-1065. https://doi.org/10.1161/01.cir.93.5.1043</w:t>
+        <w:t>[18] Woolf CJ. Central sensitization: Implications for the diagnosis and treatment of pain. Pain 2011;152:S2-S15. https://doi.org/10.1016/j.pain.2010.09.030</w:t>
       </w:r>
     </w:p>
     <w:p>
@@ -4606,7 +4659,7 @@
         <w:rPr>
           <w:sz w:val="19"/>
         </w:rPr>
-        <w:t>[19] Laborde S, Mosley E, Thayer JF. Heart Rate Variability and Cardiac Vagal Tone in Psychophysiological Research – Recommendations for Experiment Planning, Data Analysis, and Data Reporting. Frontiers in Psychology 2017;8:213. https://doi.org/10.3389/fpsyg.2017.00213</w:t>
+        <w:t>[19] Task Force of the European Society of Cardiology and the North American Society of Pacing and Electrophysiology. Heart rate variability: standards of measurement, physiological interpretation and clinical use. Circulation 1996;93:1043-1065. https://doi.org/10.1161/01.cir.93.5.1043</w:t>
       </w:r>
     </w:p>
     <w:p>
@@ -4618,7 +4671,7 @@
         <w:rPr>
           <w:sz w:val="19"/>
         </w:rPr>
-        <w:t>[20] Bradt J, Dileo C. Music therapy for end-of-life care. Cochrane Database of Systematic Reviews 2014;(3):CD007169. https://doi.org/10.1002/14651858.cd007169.pub3</w:t>
+        <w:t>[20] Laborde S, Mosley E, Thayer JF. Heart Rate Variability and Cardiac Vagal Tone in Psychophysiological Research – Recommendations for Experiment Planning, Data Analysis, and Data Reporting. Frontiers in Psychology 2017;8:213. https://doi.org/10.3389/fpsyg.2017.00213</w:t>
       </w:r>
     </w:p>
     <w:p>
@@ -4630,7 +4683,19 @@
         <w:rPr>
           <w:sz w:val="19"/>
         </w:rPr>
-        <w:t>[21] Plaskota M, Lucas C, Evans R, Pizzoferro K, Saini T, Cook K. A hypnotherapy intervention for the treatment of anxiety in patients with cancer receiving palliative care. International Journal of Palliative Nursing 2012;18:69-75. https://doi.org/10.12968/ijpn.2012.18.2.69</w:t>
+        <w:t>[21] Bissonnette J, Dumont E, Pinard AM, Landry M, Rainville P, Ogez D. Hypnosis and music interventions for anxiety, pain, sleep and well-being in palliative care: systematic review and meta-analysis. BMJ Supportive &amp; Palliative Care 2024;13:e503-e514. https://doi.org/10.1136/bmjspcare-2022-003551</w:t>
+      </w:r>
+    </w:p>
+    <w:p>
+      <w:pPr>
+        <w:spacing w:line="360" w:lineRule="auto" w:after="60"/>
+        <w:ind w:left="504" w:hanging="504"/>
+      </w:pPr>
+      <w:r>
+        <w:rPr>
+          <w:sz w:val="19"/>
+        </w:rPr>
+        <w:t>[22] Plaskota M, Lucas C, Evans R, Pizzoferro K, Saini T, Cook K. A hypnotherapy intervention for the treatment of anxiety in patients with cancer receiving palliative care. International Journal of Palliative Nursing 2012;18:69-75. https://doi.org/10.12968/ijpn.2012.18.2.69</w:t>
       </w:r>
     </w:p>
     <w:sectPr>

</xml_diff>